<commit_message>
Add workload summary JSON and project brief document for AI agents initiatives
- Created a new workload_summary.json file containing detailed task information, priorities, assignees, and due dates for the AI agents initiatives.
- Added a project brief document for the AI agents initiatives, providing an overview and context for the project.
</commit_message>
<xml_diff>
--- a/ai-agents-initiatives-20251119-141952/artifacts/documentation/ai-agents-initiatives-20251119-141952_project_brief.docx
+++ b/ai-agents-initiatives-20251119-141952/artifacts/documentation/ai-agents-initiatives-20251119-141952_project_brief.docx
@@ -12,7 +12,7 @@
     </w:p>
     <w:p>
       <w:r>
-        <w:t>Generated on 2025-11-19 10:01 via PM Agent automated documentation.</w:t>
+        <w:t>Generated on 2025-11-19 15:54 via PM Agent automated documentation.</w:t>
       </w:r>
     </w:p>
     <w:p>
@@ -307,7 +307,7 @@
           </w:tcPr>
           <w:p>
             <w:r>
-              <w:t>Program Leadership &amp; PMO</w:t>
+              <w:t>Mark</w:t>
             </w:r>
           </w:p>
         </w:tc>
@@ -327,7 +327,7 @@
           </w:tcPr>
           <w:p>
             <w:r>
-              <w:t>todo</w:t>
+              <w:t>done</w:t>
             </w:r>
           </w:p>
         </w:tc>
@@ -359,7 +359,7 @@
           </w:tcPr>
           <w:p>
             <w:r>
-              <w:t>Program Leadership &amp; PMO</w:t>
+              <w:t>Mark</w:t>
             </w:r>
           </w:p>
         </w:tc>
@@ -379,7 +379,7 @@
           </w:tcPr>
           <w:p>
             <w:r>
-              <w:t>todo</w:t>
+              <w:t>done</w:t>
             </w:r>
           </w:p>
         </w:tc>
@@ -431,7 +431,7 @@
           </w:tcPr>
           <w:p>
             <w:r>
-              <w:t>todo</w:t>
+              <w:t>done</w:t>
             </w:r>
           </w:p>
         </w:tc>
@@ -1936,27 +1936,27 @@
           </w:tcPr>
           <w:p>
             <w:r>
-              <w:t>2026-01-31 → 2026-02-12</w:t>
-            </w:r>
-          </w:p>
-        </w:tc>
-        <w:tc>
-          <w:tcPr>
-            <w:tcW w:type="dxa" w:w="1728"/>
-          </w:tcPr>
-          <w:p>
-            <w:r>
-              <w:t>2026-09-08 → 2026-09-20</w:t>
-            </w:r>
-          </w:p>
-        </w:tc>
-        <w:tc>
-          <w:tcPr>
-            <w:tcW w:type="dxa" w:w="1728"/>
-          </w:tcPr>
-          <w:p>
-            <w:r>
-              <w:t>220</w:t>
+              <w:t>2026-01-31 → 2026-07-15</w:t>
+            </w:r>
+          </w:p>
+        </w:tc>
+        <w:tc>
+          <w:tcPr>
+            <w:tcW w:type="dxa" w:w="1728"/>
+          </w:tcPr>
+          <w:p>
+            <w:r>
+              <w:t>2026-04-08 → 2026-09-20</w:t>
+            </w:r>
+          </w:p>
+        </w:tc>
+        <w:tc>
+          <w:tcPr>
+            <w:tcW w:type="dxa" w:w="1728"/>
+          </w:tcPr>
+          <w:p>
+            <w:r>
+              <w:t>67</w:t>
             </w:r>
           </w:p>
         </w:tc>
@@ -2050,17 +2050,17 @@
           </w:tcPr>
           <w:p>
             <w:r>
-              <w:t>2026-08-29 → 2026-09-12</w:t>
-            </w:r>
-          </w:p>
-        </w:tc>
-        <w:tc>
-          <w:tcPr>
-            <w:tcW w:type="dxa" w:w="1728"/>
-          </w:tcPr>
-          <w:p>
-            <w:r>
-              <w:t>210</w:t>
+              <w:t>2026-09-03 → 2026-09-17</w:t>
+            </w:r>
+          </w:p>
+        </w:tc>
+        <w:tc>
+          <w:tcPr>
+            <w:tcW w:type="dxa" w:w="1728"/>
+          </w:tcPr>
+          <w:p>
+            <w:r>
+              <w:t>215</w:t>
             </w:r>
           </w:p>
         </w:tc>
@@ -2612,27 +2612,27 @@
           </w:tcPr>
           <w:p>
             <w:r>
-              <w:t>2026-02-14 → 2026-02-22</w:t>
-            </w:r>
-          </w:p>
-        </w:tc>
-        <w:tc>
-          <w:tcPr>
-            <w:tcW w:type="dxa" w:w="1728"/>
-          </w:tcPr>
-          <w:p>
-            <w:r>
-              <w:t>2026-09-12 → 2026-09-20</w:t>
-            </w:r>
-          </w:p>
-        </w:tc>
-        <w:tc>
-          <w:tcPr>
-            <w:tcW w:type="dxa" w:w="1728"/>
-          </w:tcPr>
-          <w:p>
-            <w:r>
-              <w:t>210</w:t>
+              <w:t>2026-02-14 → 2026-02-17</w:t>
+            </w:r>
+          </w:p>
+        </w:tc>
+        <w:tc>
+          <w:tcPr>
+            <w:tcW w:type="dxa" w:w="1728"/>
+          </w:tcPr>
+          <w:p>
+            <w:r>
+              <w:t>2026-09-17 → 2026-09-20</w:t>
+            </w:r>
+          </w:p>
+        </w:tc>
+        <w:tc>
+          <w:tcPr>
+            <w:tcW w:type="dxa" w:w="1728"/>
+          </w:tcPr>
+          <w:p>
+            <w:r>
+              <w:t>215</w:t>
             </w:r>
           </w:p>
         </w:tc>
@@ -2654,37 +2654,37 @@
           </w:tcPr>
           <w:p>
             <w:r>
-              <w:t>#55 Marketing Ops Co-Pilot Agent Design &amp; Architecture</w:t>
-            </w:r>
-          </w:p>
-        </w:tc>
-        <w:tc>
-          <w:tcPr>
-            <w:tcW w:type="dxa" w:w="1728"/>
-          </w:tcPr>
-          <w:p>
-            <w:r>
-              <w:t>2026-02-20 → 2026-03-05</w:t>
-            </w:r>
-          </w:p>
-        </w:tc>
-        <w:tc>
-          <w:tcPr>
-            <w:tcW w:type="dxa" w:w="1728"/>
-          </w:tcPr>
-          <w:p>
-            <w:r>
-              <w:t>2026-08-30 → 2026-09-12</w:t>
-            </w:r>
-          </w:p>
-        </w:tc>
-        <w:tc>
-          <w:tcPr>
-            <w:tcW w:type="dxa" w:w="1728"/>
-          </w:tcPr>
-          <w:p>
-            <w:r>
-              <w:t>191</w:t>
+              <w:t>#56 Marketing Ops Co-Pilot Data Prep &amp; Agent Training</w:t>
+            </w:r>
+          </w:p>
+        </w:tc>
+        <w:tc>
+          <w:tcPr>
+            <w:tcW w:type="dxa" w:w="1728"/>
+          </w:tcPr>
+          <w:p>
+            <w:r>
+              <w:t>2026-02-17 → 2026-03-03</w:t>
+            </w:r>
+          </w:p>
+        </w:tc>
+        <w:tc>
+          <w:tcPr>
+            <w:tcW w:type="dxa" w:w="1728"/>
+          </w:tcPr>
+          <w:p>
+            <w:r>
+              <w:t>2026-11-05 → 2026-11-19</w:t>
+            </w:r>
+          </w:p>
+        </w:tc>
+        <w:tc>
+          <w:tcPr>
+            <w:tcW w:type="dxa" w:w="1728"/>
+          </w:tcPr>
+          <w:p>
+            <w:r>
+              <w:t>261</w:t>
             </w:r>
           </w:p>
         </w:tc>
@@ -2706,37 +2706,37 @@
           </w:tcPr>
           <w:p>
             <w:r>
-              <w:t>#56 Marketing Ops Co-Pilot Data Prep &amp; Agent Training</w:t>
-            </w:r>
-          </w:p>
-        </w:tc>
-        <w:tc>
-          <w:tcPr>
-            <w:tcW w:type="dxa" w:w="1728"/>
-          </w:tcPr>
-          <w:p>
-            <w:r>
-              <w:t>2026-02-22 → 2026-03-08</w:t>
-            </w:r>
-          </w:p>
-        </w:tc>
-        <w:tc>
-          <w:tcPr>
-            <w:tcW w:type="dxa" w:w="1728"/>
-          </w:tcPr>
-          <w:p>
-            <w:r>
-              <w:t>2026-11-05 → 2026-11-19</w:t>
-            </w:r>
-          </w:p>
-        </w:tc>
-        <w:tc>
-          <w:tcPr>
-            <w:tcW w:type="dxa" w:w="1728"/>
-          </w:tcPr>
-          <w:p>
-            <w:r>
-              <w:t>256</w:t>
+              <w:t>#55 Marketing Ops Co-Pilot Agent Design &amp; Architecture</w:t>
+            </w:r>
+          </w:p>
+        </w:tc>
+        <w:tc>
+          <w:tcPr>
+            <w:tcW w:type="dxa" w:w="1728"/>
+          </w:tcPr>
+          <w:p>
+            <w:r>
+              <w:t>2026-02-20 → 2026-03-05</w:t>
+            </w:r>
+          </w:p>
+        </w:tc>
+        <w:tc>
+          <w:tcPr>
+            <w:tcW w:type="dxa" w:w="1728"/>
+          </w:tcPr>
+          <w:p>
+            <w:r>
+              <w:t>2026-08-30 → 2026-09-12</w:t>
+            </w:r>
+          </w:p>
+        </w:tc>
+        <w:tc>
+          <w:tcPr>
+            <w:tcW w:type="dxa" w:w="1728"/>
+          </w:tcPr>
+          <w:p>
+            <w:r>
+              <w:t>191</w:t>
             </w:r>
           </w:p>
         </w:tc>
@@ -4332,7 +4332,7 @@
     </w:p>
     <w:p>
       <w:r>
-        <w:t>P50 completion: 2027-02-25, P90 completion: 2027-03-26.</w:t>
+        <w:t>P50 completion: 2027-02-26, P90 completion: 2027-03-28.</w:t>
       </w:r>
     </w:p>
     <w:p>
@@ -4347,7 +4347,7 @@
     </w:p>
     <w:p>
       <w:r>
-        <w:t>- #14 Enablement and Training Sessions: correlation 1.00, avg duration 63.8 days.</w:t>
+        <w:t>- #14 Enablement and Training Sessions: correlation 1.00, avg duration 64.2 days.</w:t>
       </w:r>
     </w:p>
     <w:p>
@@ -4362,12 +4362,12 @@
     </w:p>
     <w:p>
       <w:r>
-        <w:t>- #39 Infra Ops Buddy Playbook Requirements Gathering: correlation 0.88, avg duration 15.0 days.</w:t>
+        <w:t>- #39 Infra Ops Buddy Playbook Requirements Gathering: correlation 0.88, avg duration 15.1 days.</w:t>
       </w:r>
     </w:p>
     <w:p>
       <w:r>
-        <w:t>- #9 Infra Ops Buddy Playbook Development: correlation 0.87, avg duration 61.8 days.</w:t>
+        <w:t>- #9 Infra Ops Buddy Playbook Development: correlation 0.87, avg duration 62.0 days.</w:t>
       </w:r>
     </w:p>
     <w:p>
@@ -4470,17 +4470,17 @@
           </w:tcPr>
           <w:p>
             <w:r>
-              <w:t>Program Leadership &amp; PMO</w:t>
-            </w:r>
-          </w:p>
-        </w:tc>
-        <w:tc>
-          <w:tcPr>
-            <w:tcW w:type="dxa" w:w="1728"/>
-          </w:tcPr>
-          <w:p>
-            <w:r>
-              <w:t>todo</w:t>
+              <w:t>Mark</w:t>
+            </w:r>
+          </w:p>
+        </w:tc>
+        <w:tc>
+          <w:tcPr>
+            <w:tcW w:type="dxa" w:w="1728"/>
+          </w:tcPr>
+          <w:p>
+            <w:r>
+              <w:t>done</w:t>
             </w:r>
           </w:p>
         </w:tc>
@@ -4522,7 +4522,7 @@
           </w:tcPr>
           <w:p>
             <w:r>
-              <w:t>Program Leadership &amp; PMO</w:t>
+              <w:t>Mark</w:t>
             </w:r>
           </w:p>
         </w:tc>
@@ -4574,17 +4574,17 @@
           </w:tcPr>
           <w:p>
             <w:r>
-              <w:t>Program Leadership &amp; PMO</w:t>
-            </w:r>
-          </w:p>
-        </w:tc>
-        <w:tc>
-          <w:tcPr>
-            <w:tcW w:type="dxa" w:w="1728"/>
-          </w:tcPr>
-          <w:p>
-            <w:r>
-              <w:t>todo</w:t>
+              <w:t>Mark</w:t>
+            </w:r>
+          </w:p>
+        </w:tc>
+        <w:tc>
+          <w:tcPr>
+            <w:tcW w:type="dxa" w:w="1728"/>
+          </w:tcPr>
+          <w:p>
+            <w:r>
+              <w:t>done</w:t>
             </w:r>
           </w:p>
         </w:tc>
@@ -4636,7 +4636,7 @@
           </w:tcPr>
           <w:p>
             <w:r>
-              <w:t>todo</w:t>
+              <w:t>done</w:t>
             </w:r>
           </w:p>
         </w:tc>
@@ -4678,7 +4678,7 @@
           </w:tcPr>
           <w:p>
             <w:r>
-              <w:t>Program Leadership &amp; PMO</w:t>
+              <w:t>Mark</w:t>
             </w:r>
           </w:p>
         </w:tc>
@@ -4730,7 +4730,7 @@
           </w:tcPr>
           <w:p>
             <w:r>
-              <w:t>Program Leadership &amp; PMO</w:t>
+              <w:t>Mark</w:t>
             </w:r>
           </w:p>
         </w:tc>
@@ -5449,6 +5449,111 @@
         <w:br/>
         <w:t>- Updated #18: dependencies: [13, 14, 15] -&gt; [4, 22, 63]</w:t>
         <w:br/>
+        <w:br/>
+        <w:t>## 2025-11-19 10:09:36</w:t>
+        <w:br/>
+        <w:t>Plan updated (1 change):</w:t>
+        <w:br/>
+        <w:t>- Updated #1: status: todo -&gt; done</w:t>
+        <w:br/>
+        <w:br/>
+        <w:t>## 2025-11-19 10:09:36</w:t>
+        <w:br/>
+        <w:t>Plan updated (1 change):</w:t>
+        <w:br/>
+        <w:t>- Updated #2: status: todo -&gt; done</w:t>
+        <w:br/>
+        <w:br/>
+        <w:t>## 2025-11-19 10:09:37</w:t>
+        <w:br/>
+        <w:t>Plan updated (1 change):</w:t>
+        <w:br/>
+        <w:t>- Updated #3: status: todo -&gt; done</w:t>
+        <w:br/>
+        <w:br/>
+        <w:t>## 2025-11-19 15:50:02</w:t>
+        <w:br/>
+        <w:t>Plan updated (1 change):</w:t>
+        <w:br/>
+        <w:t>- Updated #1: assignee: Program Leadership &amp; PMO -&gt; Mark</w:t>
+        <w:br/>
+        <w:br/>
+        <w:t>## 2025-11-19 15:50:02</w:t>
+        <w:br/>
+        <w:t>Plan updated (1 change):</w:t>
+        <w:br/>
+        <w:t>- Updated #2: assignee: Program Leadership &amp; PMO -&gt; Mark</w:t>
+        <w:br/>
+        <w:br/>
+        <w:t>## 2025-11-19 15:50:03</w:t>
+        <w:br/>
+        <w:t>Plan updated (1 change):</w:t>
+        <w:br/>
+        <w:t>- Updated #19: assignee: Program Leadership &amp; PMO -&gt; Mark</w:t>
+        <w:br/>
+        <w:br/>
+        <w:t>## 2025-11-19 15:50:04</w:t>
+        <w:br/>
+        <w:t>Plan updated (1 change):</w:t>
+        <w:br/>
+        <w:t>- Updated #21: assignee: Program Leadership &amp; PMO -&gt; Mark</w:t>
+        <w:br/>
+        <w:br/>
+        <w:t>## 2025-11-19 15:50:05</w:t>
+        <w:br/>
+        <w:t>Plan updated (1 change):</w:t>
+        <w:br/>
+        <w:t>- Updated #71: assignee: Program Leadership &amp; PMO -&gt; Mark</w:t>
+        <w:br/>
+        <w:br/>
+        <w:t>## 2025-11-19 15:50:06</w:t>
+        <w:br/>
+        <w:t>Plan updated (1 change):</w:t>
+        <w:br/>
+        <w:t>- Updated #72: assignee: Program Leadership &amp; PMO -&gt; Mark</w:t>
+        <w:br/>
+        <w:br/>
+        <w:t>## 2025-11-19 15:50:07</w:t>
+        <w:br/>
+        <w:t>Plan updated (1 change):</w:t>
+        <w:br/>
+        <w:t>- Updated #73: assignee: Program Leadership &amp; PMO -&gt; Mark</w:t>
+        <w:br/>
+        <w:br/>
+        <w:t>## 2025-11-19 15:50:08</w:t>
+        <w:br/>
+        <w:t>Plan updated (1 change):</w:t>
+        <w:br/>
+        <w:t>- Updated #74: assignee: Program Leadership &amp; PMO -&gt; Mark</w:t>
+        <w:br/>
+        <w:br/>
+        <w:t>## 2025-11-19 15:50:09</w:t>
+        <w:br/>
+        <w:t>Plan updated (1 change):</w:t>
+        <w:br/>
+        <w:t>- Updated #75: assignee: Program Leadership &amp; PMO -&gt; Mark</w:t>
+        <w:br/>
+        <w:br/>
+        <w:t>## 2025-11-19 15:50:10</w:t>
+        <w:br/>
+        <w:t>Plan updated (1 change):</w:t>
+        <w:br/>
+        <w:t>- Updated #84: assignee: Program Leadership &amp; PMO -&gt; Mark</w:t>
+        <w:br/>
+        <w:br/>
+        <w:t>## 2025-11-19 15:50:41</w:t>
+        <w:br/>
+        <w:t>Plan updated (1 change):</w:t>
+        <w:br/>
+        <w:t>- Updated #84: due_date: 2026-02-28 -&gt; 2026-07-31</w:t>
+        <w:br/>
+        <w:br/>
+        <w:t>## 2025-11-19 15:53:29</w:t>
+        <w:br/>
+        <w:t>Plan updated (1 change):</w:t>
+        <w:br/>
+        <w:t>- Updated #58: start_date: 2026-05-23 -&gt; 2026-05-28</w:t>
+        <w:br/>
       </w:r>
     </w:p>
     <w:p>
@@ -5457,6 +5562,61 @@
       </w:pPr>
       <w:r>
         <w:t>Artifacts Inventory</w:t>
+      </w:r>
+    </w:p>
+    <w:p>
+      <w:r>
+        <w:t>- artifacts/analysis/workload_20251119_204641/workload_summary.json (21.2 KB, updated 2025-11-19 15:46)</w:t>
+      </w:r>
+    </w:p>
+    <w:p>
+      <w:r>
+        <w:t>- artifacts/analysis/monte_carlo_20251119_204618/risk_drivers.png (32.6 KB, updated 2025-11-19 15:46)</w:t>
+      </w:r>
+    </w:p>
+    <w:p>
+      <w:r>
+        <w:t>- artifacts/analysis/monte_carlo_20251119_204618/finish_distribution.png (41.1 KB, updated 2025-11-19 15:46)</w:t>
+      </w:r>
+    </w:p>
+    <w:p>
+      <w:r>
+        <w:t>- artifacts/analysis/monte_carlo_20251119_204618/summary.json (15.8 KB, updated 2025-11-19 15:46)</w:t>
+      </w:r>
+    </w:p>
+    <w:p>
+      <w:r>
+        <w:t>- artifacts/analysis/monte_carlo_20251119_204555/risk_drivers.png (32.6 KB, updated 2025-11-19 15:45)</w:t>
+      </w:r>
+    </w:p>
+    <w:p>
+      <w:r>
+        <w:t>- artifacts/analysis/monte_carlo_20251119_204555/finish_distribution.png (40.9 KB, updated 2025-11-19 15:45)</w:t>
+      </w:r>
+    </w:p>
+    <w:p>
+      <w:r>
+        <w:t>- artifacts/analysis/monte_carlo_20251119_204555/summary.json (15.8 KB, updated 2025-11-19 15:45)</w:t>
+      </w:r>
+    </w:p>
+    <w:p>
+      <w:r>
+        <w:t>- artifacts/analysis/monte_carlo_20251119_172055/risk_drivers.png (32.5 KB, updated 2025-11-19 12:20)</w:t>
+      </w:r>
+    </w:p>
+    <w:p>
+      <w:r>
+        <w:t>- artifacts/analysis/monte_carlo_20251119_172055/finish_distribution.png (41.1 KB, updated 2025-11-19 12:20)</w:t>
+      </w:r>
+    </w:p>
+    <w:p>
+      <w:r>
+        <w:t>- artifacts/analysis/monte_carlo_20251119_172055/summary.json (15.8 KB, updated 2025-11-19 12:20)</w:t>
+      </w:r>
+    </w:p>
+    <w:p>
+      <w:r>
+        <w:t>- artifacts/documentation/ai-agents-initiatives-20251119-141952_project_brief.docx (644.0 KB, updated 2025-11-19 10:01)</w:t>
       </w:r>
     </w:p>
     <w:p>

</xml_diff>